<commit_message>
uzupełnienie stanu projektu na dzień 25.08
</commit_message>
<xml_diff>
--- a/dokumentacja.docx
+++ b/dokumentacja.docx
@@ -4,17 +4,49 @@
   <w:body>
     <w:p>
       <w:r>
-        <w:t>28.05.2026 – Start projektu</w:t>
+        <w:t>Cel  projektu: Saper </w:t>
       </w:r>
     </w:p>
     <w:p>
       <w:r>
-        <w:t>Cel  projektu:</w:t>
-      </w:r>
-      <w:r>
-        <w:t xml:space="preserve"> Saper</w:t>
+        <w:t> </w:t>
       </w:r>
     </w:p>
+    <w:p>
+      <w:r>
+        <w:t>28.05.2026 – Start projektu </w:t>
+      </w:r>
+    </w:p>
+    <w:p>
+      <w:r>
+        <w:t>Długo - Wakacje </w:t>
+      </w:r>
+      <w:r>
+        <w:br/>
+        <w:t> </w:t>
+      </w:r>
+      <w:r>
+        <w:br/>
+        <w:t>24.08.2026 - Rzeczywiste rozpoczęcie prac nad projektem. Zrobiona została plansza i wybór pola przez użytownika. </w:t>
+      </w:r>
+      <w:r>
+        <w:br/>
+        <w:t> </w:t>
+      </w:r>
+      <w:r>
+        <w:br/>
+        <w:t>25.08.2026 - Umieszczenie min na planszy. Dodanie zakończenia gry w momencie natrafienia na minę. </w:t>
+      </w:r>
+      <w:r>
+        <w:br/>
+        <w:t> </w:t>
+      </w:r>
+      <w:r>
+        <w:br/>
+        <w:t> </w:t>
+      </w:r>
+    </w:p>
+    <w:p/>
     <w:sectPr>
       <w:pgSz w:w="11906" w:h="16838"/>
       <w:pgMar w:top="1417" w:right="1417" w:bottom="1417" w:left="1417" w:header="708" w:footer="708" w:gutter="0"/>
@@ -427,7 +459,6 @@
   <w:style w:type="character" w:default="1" w:styleId="DefaultParagraphFont">
     <w:name w:val="Default Paragraph Font"/>
     <w:uiPriority w:val="1"/>
-    <w:semiHidden/>
     <w:unhideWhenUsed/>
   </w:style>
   <w:style w:type="table" w:default="1" w:styleId="TableNormal">

</xml_diff>

<commit_message>
Uzupełnienie dokumentacji na stan z dnia 28.08
</commit_message>
<xml_diff>
--- a/dokumentacja.docx
+++ b/dokumentacja.docx
@@ -36,6 +36,85 @@
       <w:r>
         <w:br/>
         <w:t>25.08.2026 - Umieszczenie min na planszy. Dodanie zakończenia gry w momencie natrafienia na minę. </w:t>
+      </w:r>
+    </w:p>
+    <w:p>
+      <w:r>
+        <w:t>26.08</w:t>
+      </w:r>
+      <w:r>
+        <w:t xml:space="preserve">.2026 </w:t>
+      </w:r>
+      <w:r>
+        <w:t>–</w:t>
+      </w:r>
+      <w:r>
+        <w:t xml:space="preserve"> </w:t>
+      </w:r>
+      <w:r>
+        <w:t xml:space="preserve">Wyświetlanie na wybranym polu liczby </w:t>
+      </w:r>
+      <w:r>
+        <w:t>min na polach sąsiadujących</w:t>
+      </w:r>
+      <w:r>
+        <w:t>.</w:t>
+      </w:r>
+    </w:p>
+    <w:p>
+      <w:r>
+        <w:t>27.08</w:t>
+      </w:r>
+      <w:r>
+        <w:t xml:space="preserve">.2026 </w:t>
+      </w:r>
+      <w:r>
+        <w:t>– Część programu odpowiedzialna</w:t>
+      </w:r>
+      <w:r>
+        <w:t xml:space="preserve"> za wyświetlanie liczby min na polach sąsiaduj</w:t>
+      </w:r>
+      <w:r>
+        <w:t xml:space="preserve">ących została przypisana do funkcji. Dodanie automatycznego </w:t>
+      </w:r>
+      <w:r>
+        <w:t xml:space="preserve">odkrywania pól sąsiadujących dla </w:t>
+      </w:r>
+      <w:r>
+        <w:t xml:space="preserve">pola </w:t>
+      </w:r>
+      <w:r>
+        <w:t xml:space="preserve">z zerową </w:t>
+      </w:r>
+      <w:r>
+        <w:t>liczbą min sąsiadujących. Wykorzystanie funkcji rekurencyjnej. Pierwsza wersja w pełni działającego projektu. N</w:t>
+      </w:r>
+      <w:r>
+        <w:t>a ten dzień można bez problemu rozwiązać sapera</w:t>
+      </w:r>
+      <w:r>
+        <w:t>, ale nie jest on jeszcze</w:t>
+      </w:r>
+      <w:r>
+        <w:t xml:space="preserve"> ta</w:t>
+      </w:r>
+      <w:r>
+        <w:t xml:space="preserve">ki sam jak </w:t>
+      </w:r>
+      <w:r>
+        <w:t>oryginaln</w:t>
+      </w:r>
+      <w:r>
+        <w:t>a</w:t>
+      </w:r>
+      <w:r>
+        <w:t xml:space="preserve"> wersj</w:t>
+      </w:r>
+      <w:r>
+        <w:t>a</w:t>
+      </w:r>
+      <w:r>
+        <w:t>.</w:t>
       </w:r>
       <w:r>
         <w:br/>
@@ -459,6 +538,7 @@
   <w:style w:type="character" w:default="1" w:styleId="DefaultParagraphFont">
     <w:name w:val="Default Paragraph Font"/>
     <w:uiPriority w:val="1"/>
+    <w:semiHidden/>
     <w:unhideWhenUsed/>
   </w:style>
   <w:style w:type="table" w:default="1" w:styleId="TableNormal">

</xml_diff>

<commit_message>
Dodanie flag + uzupełnienie dokumentacji
</commit_message>
<xml_diff>
--- a/dokumentacja.docx
+++ b/dokumentacja.docx
@@ -23,18 +23,26 @@
       </w:r>
       <w:r>
         <w:br/>
+      </w:r>
+      <w:r>
         <w:t> </w:t>
       </w:r>
       <w:r>
         <w:br/>
+      </w:r>
+      <w:r>
         <w:t>24.08.2026 - Rzeczywiste rozpoczęcie prac nad projektem. Zrobiona została plansza i wybór pola przez użytownika. </w:t>
       </w:r>
       <w:r>
         <w:br/>
+      </w:r>
+      <w:r>
         <w:t> </w:t>
       </w:r>
       <w:r>
         <w:br/>
+      </w:r>
+      <w:r>
         <w:t>25.08.2026 - Umieszczenie min na planszy. Dodanie zakończenia gry w momencie natrafienia na minę. </w:t>
       </w:r>
     </w:p>
@@ -63,71 +71,149 @@
     </w:p>
     <w:p>
       <w:r>
+        <w:rPr/>
         <w:t>27.08</w:t>
       </w:r>
       <w:r>
+        <w:rPr/>
         <w:t xml:space="preserve">.2026 </w:t>
       </w:r>
       <w:r>
+        <w:rPr/>
         <w:t>– Część programu odpowiedzialna</w:t>
       </w:r>
       <w:r>
+        <w:rPr/>
         <w:t xml:space="preserve"> za wyświetlanie liczby min na polach sąsiaduj</w:t>
       </w:r>
       <w:r>
+        <w:rPr/>
         <w:t xml:space="preserve">ących została przypisana do funkcji. Dodanie automatycznego </w:t>
       </w:r>
       <w:r>
+        <w:rPr/>
         <w:t xml:space="preserve">odkrywania pól sąsiadujących dla </w:t>
       </w:r>
       <w:r>
+        <w:rPr/>
         <w:t xml:space="preserve">pola </w:t>
       </w:r>
       <w:r>
+        <w:rPr/>
         <w:t xml:space="preserve">z zerową </w:t>
       </w:r>
       <w:r>
+        <w:rPr/>
         <w:t>liczbą min sąsiadujących. Wykorzystanie funkcji rekurencyjnej. Pierwsza wersja w pełni działającego projektu. N</w:t>
       </w:r>
       <w:r>
+        <w:rPr/>
         <w:t>a ten dzień można bez problemu rozwiązać sapera</w:t>
       </w:r>
       <w:r>
+        <w:rPr/>
         <w:t>, ale nie jest on jeszcze</w:t>
       </w:r>
       <w:r>
+        <w:rPr/>
         <w:t xml:space="preserve"> ta</w:t>
       </w:r>
       <w:r>
+        <w:rPr/>
         <w:t xml:space="preserve">ki sam jak </w:t>
       </w:r>
       <w:r>
+        <w:rPr/>
         <w:t>oryginaln</w:t>
       </w:r>
       <w:r>
+        <w:rPr/>
         <w:t>a</w:t>
       </w:r>
       <w:r>
+        <w:rPr/>
         <w:t xml:space="preserve"> wersj</w:t>
       </w:r>
       <w:r>
+        <w:rPr/>
         <w:t>a</w:t>
       </w:r>
       <w:r>
+        <w:rPr/>
         <w:t>.</w:t>
       </w:r>
       <w:r>
         <w:br/>
+      </w:r>
+      <w:r>
+        <w:br/>
+      </w:r>
+      <w:r>
+        <w:rPr/>
+        <w:t>28.08.2026 - nic</w:t>
+      </w:r>
+    </w:p>
+    <w:p>
+      <w:r>
+        <w:rPr/>
+        <w:t>29.08.2026 - Dodanie wyboru akcji użytkownika, dodawanie flag</w:t>
+      </w:r>
+      <w:r>
+        <w:rPr/>
+        <w:t xml:space="preserve">, które blokują  </w:t>
+      </w:r>
+      <w:r>
+        <w:rPr/>
+        <w:t>mozliwość</w:t>
+      </w:r>
+      <w:r>
+        <w:rPr/>
+        <w:t xml:space="preserve"> odsłonięcia danego pola, usuwanie flag</w:t>
+      </w:r>
+      <w:r>
+        <w:rPr/>
+        <w:t>,</w:t>
+      </w:r>
+      <w:r>
+        <w:rPr/>
+        <w:t xml:space="preserve"> licznik pozostałych flag. </w:t>
+      </w:r>
+      <w:r>
+        <w:rPr/>
+        <w:t xml:space="preserve">Poprawa wyglądu planszy. </w:t>
+      </w:r>
+      <w:r>
+        <w:br/>
+      </w:r>
+      <w:r>
+        <w:rPr/>
+        <w:t xml:space="preserve">Saper wciąż działa. Coraz </w:t>
+      </w:r>
+      <w:r>
+        <w:rPr/>
+        <w:t xml:space="preserve">bliżej do oryginału. </w:t>
+      </w:r>
+      <w:r>
+        <w:br/>
+      </w:r>
+      <w:r>
+        <w:br/>
+      </w:r>
+      <w:r>
+        <w:rPr/>
         <w:t> </w:t>
       </w:r>
       <w:r>
         <w:br/>
+      </w:r>
+      <w:r>
+        <w:rPr/>
         <w:t> </w:t>
       </w:r>
     </w:p>
     <w:p/>
     <w:sectPr>
-      <w:pgSz w:w="11906" w:h="16838"/>
+      <w:pgSz w:w="11906" w:h="16838" w:orient="portrait"/>
       <w:pgMar w:top="1417" w:right="1417" w:bottom="1417" w:left="1417" w:header="708" w:footer="708" w:gutter="0"/>
       <w:cols w:space="708"/>
       <w:docGrid w:linePitch="360"/>
@@ -137,11 +223,11 @@
 </file>
 
 <file path=word/styles.xml><?xml version="1.0" encoding="utf-8"?>
-<w:styles xmlns:mc="http://schemas.openxmlformats.org/markup-compatibility/2006" xmlns:r="http://schemas.openxmlformats.org/officeDocument/2006/relationships" xmlns:w="http://schemas.openxmlformats.org/wordprocessingml/2006/main" xmlns:w14="http://schemas.microsoft.com/office/word/2010/wordml" xmlns:w15="http://schemas.microsoft.com/office/word/2012/wordml" xmlns:w16cex="http://schemas.microsoft.com/office/word/2018/wordml/cex" xmlns:w16cid="http://schemas.microsoft.com/office/word/2016/wordml/cid" xmlns:w16="http://schemas.microsoft.com/office/word/2018/wordml" xmlns:w16du="http://schemas.microsoft.com/office/word/2023/wordml/word16du" xmlns:w16sdtdh="http://schemas.microsoft.com/office/word/2020/wordml/sdtdatahash" xmlns:w16sdtfl="http://schemas.microsoft.com/office/word/2024/wordml/sdtformatlock" xmlns:w16se="http://schemas.microsoft.com/office/word/2015/wordml/symex" mc:Ignorable="w14 w15 w16se w16cid w16 w16cex w16sdtdh w16sdtfl w16du">
+<w:styles xmlns:wp14="http://schemas.microsoft.com/office/word/2010/wordprocessingDrawing" xmlns:mc="http://schemas.openxmlformats.org/markup-compatibility/2006" xmlns:r="http://schemas.openxmlformats.org/officeDocument/2006/relationships" xmlns:w="http://schemas.openxmlformats.org/wordprocessingml/2006/main" xmlns:w14="http://schemas.microsoft.com/office/word/2010/wordml" xmlns:w15="http://schemas.microsoft.com/office/word/2012/wordml" xmlns:w16cex="http://schemas.microsoft.com/office/word/2018/wordml/cex" xmlns:w16cid="http://schemas.microsoft.com/office/word/2016/wordml/cid" xmlns:w16="http://schemas.microsoft.com/office/word/2018/wordml" xmlns:w16du="http://schemas.microsoft.com/office/word/2023/wordml/word16du" xmlns:w16sdtdh="http://schemas.microsoft.com/office/word/2020/wordml/sdtdatahash" xmlns:w16sdtfl="http://schemas.microsoft.com/office/word/2024/wordml/sdtformatlock" xmlns:w16se="http://schemas.microsoft.com/office/word/2015/wordml/symex" mc:Ignorable="w14 w15 w16se w16cid w16 w16cex w16sdtdh w16sdtfl w16du wp14">
   <w:docDefaults>
     <w:rPrDefault>
       <w:rPr>
-        <w:rFonts w:asciiTheme="minorHAnsi" w:eastAsiaTheme="minorEastAsia" w:hAnsiTheme="minorHAnsi" w:cstheme="minorBidi"/>
+        <w:rFonts w:asciiTheme="minorHAnsi" w:hAnsiTheme="minorHAnsi" w:eastAsiaTheme="minorEastAsia" w:cstheme="minorBidi"/>
         <w:sz w:val="22"/>
         <w:szCs w:val="22"/>
         <w:lang w:val="pl-PL" w:eastAsia="pl-PL" w:bidi="ar-SA"/>
@@ -156,14 +242,14 @@
   <w:latentStyles w:defLockedState="0" w:defUIPriority="99" w:defSemiHidden="0" w:defUnhideWhenUsed="0" w:defQFormat="0" w:count="376">
     <w:lsdException w:name="Normal" w:uiPriority="0" w:qFormat="1"/>
     <w:lsdException w:name="heading 1" w:uiPriority="9" w:qFormat="1"/>
-    <w:lsdException w:name="heading 2" w:semiHidden="1" w:uiPriority="9" w:unhideWhenUsed="1" w:qFormat="1"/>
-    <w:lsdException w:name="heading 3" w:semiHidden="1" w:uiPriority="9" w:unhideWhenUsed="1" w:qFormat="1"/>
-    <w:lsdException w:name="heading 4" w:semiHidden="1" w:uiPriority="9" w:unhideWhenUsed="1" w:qFormat="1"/>
-    <w:lsdException w:name="heading 5" w:semiHidden="1" w:uiPriority="9" w:unhideWhenUsed="1" w:qFormat="1"/>
-    <w:lsdException w:name="heading 6" w:semiHidden="1" w:uiPriority="9" w:unhideWhenUsed="1" w:qFormat="1"/>
-    <w:lsdException w:name="heading 7" w:semiHidden="1" w:uiPriority="9" w:unhideWhenUsed="1" w:qFormat="1"/>
-    <w:lsdException w:name="heading 8" w:semiHidden="1" w:uiPriority="9" w:unhideWhenUsed="1" w:qFormat="1"/>
-    <w:lsdException w:name="heading 9" w:semiHidden="1" w:uiPriority="9" w:unhideWhenUsed="1" w:qFormat="1"/>
+    <w:lsdException w:name="heading 2" w:uiPriority="9" w:semiHidden="1" w:unhideWhenUsed="1" w:qFormat="1"/>
+    <w:lsdException w:name="heading 3" w:uiPriority="9" w:semiHidden="1" w:unhideWhenUsed="1" w:qFormat="1"/>
+    <w:lsdException w:name="heading 4" w:uiPriority="9" w:semiHidden="1" w:unhideWhenUsed="1" w:qFormat="1"/>
+    <w:lsdException w:name="heading 5" w:uiPriority="9" w:semiHidden="1" w:unhideWhenUsed="1" w:qFormat="1"/>
+    <w:lsdException w:name="heading 6" w:uiPriority="9" w:semiHidden="1" w:unhideWhenUsed="1" w:qFormat="1"/>
+    <w:lsdException w:name="heading 7" w:uiPriority="9" w:semiHidden="1" w:unhideWhenUsed="1" w:qFormat="1"/>
+    <w:lsdException w:name="heading 8" w:uiPriority="9" w:semiHidden="1" w:unhideWhenUsed="1" w:qFormat="1"/>
+    <w:lsdException w:name="heading 9" w:uiPriority="9" w:semiHidden="1" w:unhideWhenUsed="1" w:qFormat="1"/>
     <w:lsdException w:name="index 1" w:semiHidden="1" w:unhideWhenUsed="1"/>
     <w:lsdException w:name="index 2" w:semiHidden="1" w:unhideWhenUsed="1"/>
     <w:lsdException w:name="index 3" w:semiHidden="1" w:unhideWhenUsed="1"/>
@@ -173,22 +259,22 @@
     <w:lsdException w:name="index 7" w:semiHidden="1" w:unhideWhenUsed="1"/>
     <w:lsdException w:name="index 8" w:semiHidden="1" w:unhideWhenUsed="1"/>
     <w:lsdException w:name="index 9" w:semiHidden="1" w:unhideWhenUsed="1"/>
-    <w:lsdException w:name="toc 1" w:semiHidden="1" w:uiPriority="39" w:unhideWhenUsed="1"/>
-    <w:lsdException w:name="toc 2" w:semiHidden="1" w:uiPriority="39" w:unhideWhenUsed="1"/>
-    <w:lsdException w:name="toc 3" w:semiHidden="1" w:uiPriority="39" w:unhideWhenUsed="1"/>
-    <w:lsdException w:name="toc 4" w:semiHidden="1" w:uiPriority="39" w:unhideWhenUsed="1"/>
-    <w:lsdException w:name="toc 5" w:semiHidden="1" w:uiPriority="39" w:unhideWhenUsed="1"/>
-    <w:lsdException w:name="toc 6" w:semiHidden="1" w:uiPriority="39" w:unhideWhenUsed="1"/>
-    <w:lsdException w:name="toc 7" w:semiHidden="1" w:uiPriority="39" w:unhideWhenUsed="1"/>
-    <w:lsdException w:name="toc 8" w:semiHidden="1" w:uiPriority="39" w:unhideWhenUsed="1"/>
-    <w:lsdException w:name="toc 9" w:semiHidden="1" w:uiPriority="39" w:unhideWhenUsed="1"/>
+    <w:lsdException w:name="toc 1" w:uiPriority="39" w:semiHidden="1" w:unhideWhenUsed="1"/>
+    <w:lsdException w:name="toc 2" w:uiPriority="39" w:semiHidden="1" w:unhideWhenUsed="1"/>
+    <w:lsdException w:name="toc 3" w:uiPriority="39" w:semiHidden="1" w:unhideWhenUsed="1"/>
+    <w:lsdException w:name="toc 4" w:uiPriority="39" w:semiHidden="1" w:unhideWhenUsed="1"/>
+    <w:lsdException w:name="toc 5" w:uiPriority="39" w:semiHidden="1" w:unhideWhenUsed="1"/>
+    <w:lsdException w:name="toc 6" w:uiPriority="39" w:semiHidden="1" w:unhideWhenUsed="1"/>
+    <w:lsdException w:name="toc 7" w:uiPriority="39" w:semiHidden="1" w:unhideWhenUsed="1"/>
+    <w:lsdException w:name="toc 8" w:uiPriority="39" w:semiHidden="1" w:unhideWhenUsed="1"/>
+    <w:lsdException w:name="toc 9" w:uiPriority="39" w:semiHidden="1" w:unhideWhenUsed="1"/>
     <w:lsdException w:name="Normal Indent" w:semiHidden="1" w:unhideWhenUsed="1"/>
     <w:lsdException w:name="footnote text" w:semiHidden="1" w:unhideWhenUsed="1"/>
     <w:lsdException w:name="annotation text" w:semiHidden="1" w:unhideWhenUsed="1"/>
     <w:lsdException w:name="header" w:semiHidden="1" w:unhideWhenUsed="1"/>
     <w:lsdException w:name="footer" w:semiHidden="1" w:unhideWhenUsed="1"/>
     <w:lsdException w:name="index heading" w:semiHidden="1" w:unhideWhenUsed="1"/>
-    <w:lsdException w:name="caption" w:semiHidden="1" w:uiPriority="35" w:unhideWhenUsed="1" w:qFormat="1"/>
+    <w:lsdException w:name="caption" w:uiPriority="35" w:semiHidden="1" w:unhideWhenUsed="1" w:qFormat="1"/>
     <w:lsdException w:name="table of figures" w:semiHidden="1" w:unhideWhenUsed="1"/>
     <w:lsdException w:name="envelope address" w:semiHidden="1" w:unhideWhenUsed="1"/>
     <w:lsdException w:name="envelope return" w:semiHidden="1" w:unhideWhenUsed="1"/>
@@ -219,7 +305,7 @@
     <w:lsdException w:name="Title" w:uiPriority="10" w:qFormat="1"/>
     <w:lsdException w:name="Closing" w:semiHidden="1" w:unhideWhenUsed="1"/>
     <w:lsdException w:name="Signature" w:semiHidden="1" w:unhideWhenUsed="1"/>
-    <w:lsdException w:name="Default Paragraph Font" w:semiHidden="1" w:uiPriority="1" w:unhideWhenUsed="1"/>
+    <w:lsdException w:name="Default Paragraph Font" w:uiPriority="1" w:semiHidden="1" w:unhideWhenUsed="1"/>
     <w:lsdException w:name="Body Text" w:semiHidden="1" w:unhideWhenUsed="1"/>
     <w:lsdException w:name="Body Text Indent" w:semiHidden="1" w:unhideWhenUsed="1"/>
     <w:lsdException w:name="List Continue" w:semiHidden="1" w:unhideWhenUsed="1"/>
@@ -419,8 +505,8 @@
     <w:lsdException w:name="Subtle Reference" w:uiPriority="31" w:qFormat="1"/>
     <w:lsdException w:name="Intense Reference" w:uiPriority="32" w:qFormat="1"/>
     <w:lsdException w:name="Book Title" w:uiPriority="33" w:qFormat="1"/>
-    <w:lsdException w:name="Bibliography" w:semiHidden="1" w:uiPriority="37" w:unhideWhenUsed="1"/>
-    <w:lsdException w:name="TOC Heading" w:semiHidden="1" w:uiPriority="39" w:unhideWhenUsed="1" w:qFormat="1"/>
+    <w:lsdException w:name="Bibliography" w:uiPriority="37" w:semiHidden="1" w:unhideWhenUsed="1"/>
+    <w:lsdException w:name="TOC Heading" w:uiPriority="39" w:semiHidden="1" w:unhideWhenUsed="1" w:qFormat="1"/>
     <w:lsdException w:name="Plain Table 1" w:uiPriority="41"/>
     <w:lsdException w:name="Plain Table 2" w:uiPriority="42"/>
     <w:lsdException w:name="Plain Table 3" w:uiPriority="43"/>
@@ -531,17 +617,17 @@
     <w:lsdException w:name="Unresolved Mention" w:semiHidden="1" w:unhideWhenUsed="1"/>
     <w:lsdException w:name="Smart Link" w:semiHidden="1" w:unhideWhenUsed="1"/>
   </w:latentStyles>
-  <w:style w:type="paragraph" w:default="1" w:styleId="Normal">
+  <w:style w:type="paragraph" w:styleId="Normal" w:default="1">
     <w:name w:val="Normal"/>
     <w:qFormat/>
   </w:style>
-  <w:style w:type="character" w:default="1" w:styleId="DefaultParagraphFont">
+  <w:style w:type="character" w:styleId="DefaultParagraphFont" w:default="1">
     <w:name w:val="Default Paragraph Font"/>
     <w:uiPriority w:val="1"/>
     <w:semiHidden/>
     <w:unhideWhenUsed/>
   </w:style>
-  <w:style w:type="table" w:default="1" w:styleId="TableNormal">
+  <w:style w:type="table" w:styleId="TableNormal" w:default="1">
     <w:name w:val="Normal Table"/>
     <w:uiPriority w:val="99"/>
     <w:semiHidden/>
@@ -556,7 +642,7 @@
       </w:tblCellMar>
     </w:tblPr>
   </w:style>
-  <w:style w:type="numbering" w:default="1" w:styleId="NoList">
+  <w:style w:type="numbering" w:styleId="NoList" w:default="1">
     <w:name w:val="No List"/>
     <w:uiPriority w:val="99"/>
     <w:semiHidden/>

</xml_diff>

<commit_message>
uzupełnienie dokumentacji z 30.08
</commit_message>
<xml_diff>
--- a/dokumentacja.docx
+++ b/dokumentacja.docx
@@ -1,6 +1,6 @@
 
 <file path=word/document.xml><?xml version="1.0" encoding="utf-8"?>
-<w:document xmlns:wpc="http://schemas.microsoft.com/office/word/2010/wordprocessingCanvas" xmlns:cx="http://schemas.microsoft.com/office/drawing/2014/chartex" xmlns:cx1="http://schemas.microsoft.com/office/drawing/2015/9/8/chartex" xmlns:cx2="http://schemas.microsoft.com/office/drawing/2015/10/21/chartex" xmlns:cx3="http://schemas.microsoft.com/office/drawing/2016/5/9/chartex" xmlns:cx4="http://schemas.microsoft.com/office/drawing/2016/5/10/chartex" xmlns:cx5="http://schemas.microsoft.com/office/drawing/2016/5/11/chartex" xmlns:cx6="http://schemas.microsoft.com/office/drawing/2016/5/12/chartex" xmlns:cx7="http://schemas.microsoft.com/office/drawing/2016/5/13/chartex" xmlns:cx8="http://schemas.microsoft.com/office/drawing/2016/5/14/chartex" xmlns:mc="http://schemas.openxmlformats.org/markup-compatibility/2006" xmlns:aink="http://schemas.microsoft.com/office/drawing/2016/ink" xmlns:am3d="http://schemas.microsoft.com/office/drawing/2017/model3d" xmlns:o="urn:schemas-microsoft-com:office:office" xmlns:oel="http://schemas.microsoft.com/office/2019/extlst" xmlns:r="http://schemas.openxmlformats.org/officeDocument/2006/relationships" xmlns:m="http://schemas.openxmlformats.org/officeDocument/2006/math" xmlns:v="urn:schemas-microsoft-com:vml" xmlns:wp14="http://schemas.microsoft.com/office/word/2010/wordprocessingDrawing" xmlns:wp="http://schemas.openxmlformats.org/drawingml/2006/wordprocessingDrawing" xmlns:w10="urn:schemas-microsoft-com:office:word" xmlns:w="http://schemas.openxmlformats.org/wordprocessingml/2006/main" xmlns:w14="http://schemas.microsoft.com/office/word/2010/wordml" xmlns:w15="http://schemas.microsoft.com/office/word/2012/wordml" xmlns:w16cex="http://schemas.microsoft.com/office/word/2018/wordml/cex" xmlns:w16cid="http://schemas.microsoft.com/office/word/2016/wordml/cid" xmlns:w16="http://schemas.microsoft.com/office/word/2018/wordml" xmlns:w16du="http://schemas.microsoft.com/office/word/2023/wordml/word16du" xmlns:w16sdtdh="http://schemas.microsoft.com/office/word/2020/wordml/sdtdatahash" xmlns:w16sdtfl="http://schemas.microsoft.com/office/word/2024/wordml/sdtformatlock" xmlns:w16se="http://schemas.microsoft.com/office/word/2015/wordml/symex" xmlns:wpg="http://schemas.microsoft.com/office/word/2010/wordprocessingGroup" xmlns:wpi="http://schemas.microsoft.com/office/word/2010/wordprocessingInk" xmlns:wne="http://schemas.microsoft.com/office/word/2006/wordml" xmlns:wps="http://schemas.microsoft.com/office/word/2010/wordprocessingShape" mc:Ignorable="w14 w15 w16se w16cid w16 w16cex w16sdtdh w16sdtfl w16du wp14">
+<w:document xmlns:wpc="http://schemas.microsoft.com/office/word/2010/wordprocessingCanvas" xmlns:cx="http://schemas.microsoft.com/office/drawing/2014/chartex" xmlns:cx1="http://schemas.microsoft.com/office/drawing/2015/9/8/chartex" xmlns:cx2="http://schemas.microsoft.com/office/drawing/2015/10/21/chartex" xmlns:cx3="http://schemas.microsoft.com/office/drawing/2016/5/9/chartex" xmlns:cx4="http://schemas.microsoft.com/office/drawing/2016/5/10/chartex" xmlns:cx5="http://schemas.microsoft.com/office/drawing/2016/5/11/chartex" xmlns:cx6="http://schemas.microsoft.com/office/drawing/2016/5/12/chartex" xmlns:cx7="http://schemas.microsoft.com/office/drawing/2016/5/13/chartex" xmlns:cx8="http://schemas.microsoft.com/office/drawing/2016/5/14/chartex" xmlns:mc="http://schemas.openxmlformats.org/markup-compatibility/2006" xmlns:aink="http://schemas.microsoft.com/office/drawing/2016/ink" xmlns:am3d="http://schemas.microsoft.com/office/drawing/2017/model3d" xmlns:o="urn:schemas-microsoft-com:office:office" xmlns:oel="http://schemas.microsoft.com/office/2019/extlst" xmlns:r="http://schemas.openxmlformats.org/officeDocument/2006/relationships" xmlns:m="http://schemas.openxmlformats.org/officeDocument/2006/math" xmlns:v="urn:schemas-microsoft-com:vml" xmlns:wp14="http://schemas.microsoft.com/office/word/2010/wordprocessingDrawing" xmlns:wp="http://schemas.openxmlformats.org/drawingml/2006/wordprocessingDrawing" xmlns:w10="urn:schemas-microsoft-com:office:word" xmlns:w="http://schemas.openxmlformats.org/wordprocessingml/2006/main" xmlns:w14="http://schemas.microsoft.com/office/word/2010/wordml" xmlns:w15="http://schemas.microsoft.com/office/word/2012/wordml" xmlns:w16cex="http://schemas.microsoft.com/office/word/2018/wordml/cex" xmlns:w16cid="http://schemas.microsoft.com/office/word/2016/wordml/cid" xmlns:w16="http://schemas.microsoft.com/office/word/2018/wordml" xmlns:w16du="http://schemas.microsoft.com/office/word/2023/wordml/word16du" xmlns:w16sdtdh="http://schemas.microsoft.com/office/word/2020/wordml/sdtdatahash" xmlns:w16sdtfl="http://schemas.microsoft.com/office/word/2024/wordml/sdtformatlock" xmlns:w16se="http://schemas.microsoft.com/office/word/2015/wordml/symex" xmlns:wpg="http://schemas.microsoft.com/office/word/2010/wordprocessingGroup" xmlns:wpi="http://schemas.microsoft.com/office/word/2010/wordprocessingInk" xmlns:wne="http://schemas.microsoft.com/office/word/2006/wordml" xmlns:wps="http://schemas.microsoft.com/office/word/2010/wordprocessingShape" xmlns:a="http://schemas.openxmlformats.org/drawingml/2006/main" xmlns:pic="http://schemas.openxmlformats.org/drawingml/2006/picture" xmlns:a14="http://schemas.microsoft.com/office/drawing/2010/main" mc:Ignorable="w14 w15 w16se w16cid w16 w16cex w16sdtdh w16sdtfl w16du wp14">
   <w:body>
     <w:p>
       <w:r>
@@ -193,6 +193,82 @@
         <w:rPr/>
         <w:t xml:space="preserve">bliżej do oryginału. </w:t>
       </w:r>
+    </w:p>
+    <w:p>
+      <w:r>
+        <w:rPr/>
+        <w:t xml:space="preserve">30.08.2026 - Dodanie licznika czasu </w:t>
+      </w:r>
+      <w:r>
+        <w:rPr/>
+        <w:t>gry, od teraz miny odkrywają się po przegranej. Pod koniec gry program pyta o ponowne rozpoczęcie.</w:t>
+      </w:r>
+      <w:r>
+        <w:rPr/>
+        <w:t xml:space="preserve"> Główny zamysł sapera został skończony. Program daje efekt podobny do oryginalnej gry i zawiera większość jej elementów.</w:t>
+      </w:r>
+      <w:r>
+        <w:rPr/>
+        <w:t xml:space="preserve"> </w:t>
+      </w:r>
+    </w:p>
+    <w:p>
+      <w:pPr>
+        <w:pStyle w:val="Normal"/>
+      </w:pPr>
+      <w:r>
+        <w:rPr/>
+        <w:t xml:space="preserve">Aktualny wygląd gry: </w:t>
+      </w:r>
+      <w:r>
+        <w:br/>
+      </w:r>
+      <w:r>
+        <w:drawing>
+          <wp:inline wp14:editId="3F9003EA" wp14:anchorId="2F9DF4C0">
+            <wp:extent cx="4536660" cy="2734348"/>
+            <wp:effectExtent l="0" t="0" r="0" b="0"/>
+            <wp:docPr id="634502480" name="drawing"/>
+            <wp:cNvGraphicFramePr>
+              <a:graphicFrameLocks noChangeAspect="1"/>
+            </wp:cNvGraphicFramePr>
+            <a:graphic>
+              <a:graphicData xmlns:a="http://schemas.openxmlformats.org/drawingml/2006/main" uri="http://schemas.openxmlformats.org/drawingml/2006/picture">
+                <pic:pic xmlns:pic="http://schemas.openxmlformats.org/drawingml/2006/picture">
+                  <pic:nvPicPr>
+                    <pic:cNvPr id="269171600" name="Picture 269171600"/>
+                    <pic:cNvPicPr/>
+                  </pic:nvPicPr>
+                  <pic:blipFill>
+                    <a:blip xmlns:r="http://schemas.openxmlformats.org/officeDocument/2006/relationships" r:embed="rId1057991955">
+                      <a:extLst>
+                        <a:ext uri="{28A0092B-C50C-407E-A947-70E740481C1C}">
+                          <a14:useLocalDpi xmlns:a14="http://schemas.microsoft.com/office/drawing/2010/main"/>
+                        </a:ext>
+                      </a:extLst>
+                    </a:blip>
+                    <a:stretch>
+                      <a:fillRect/>
+                    </a:stretch>
+                  </pic:blipFill>
+                  <pic:spPr>
+                    <a:xfrm rot="0">
+                      <a:off x="0" y="0"/>
+                      <a:ext cx="4536660" cy="2734348"/>
+                    </a:xfrm>
+                    <a:prstGeom prst="rect">
+                      <a:avLst/>
+                    </a:prstGeom>
+                  </pic:spPr>
+                </pic:pic>
+              </a:graphicData>
+            </a:graphic>
+          </wp:inline>
+        </w:drawing>
+      </w:r>
+      <w:r>
+        <w:br/>
+      </w:r>
       <w:r>
         <w:br/>
       </w:r>
@@ -211,7 +287,11 @@
         <w:t> </w:t>
       </w:r>
     </w:p>
-    <w:p/>
+    <w:p>
+      <w:pPr>
+        <w:pStyle w:val="Normal"/>
+      </w:pPr>
+    </w:p>
     <w:sectPr>
       <w:pgSz w:w="11906" w:h="16838" w:orient="portrait"/>
       <w:pgMar w:top="1417" w:right="1417" w:bottom="1417" w:left="1417" w:header="708" w:footer="708" w:gutter="0"/>

</xml_diff>